<commit_message>
fix(manuscript): reconcile Table 3 and Table 5 with authentic repository results
</commit_message>
<xml_diff>
--- a/Springer_Nature_Manuscript_DNA_Plus.docx
+++ b/Springer_Nature_Manuscript_DNA_Plus.docx
@@ -3756,14 +3756,7 @@
             </w:tcBorders>
           </w:tcPr>
           <w:p>
-            <w:pPr>
-              <w:spacing w:before="40" w:after="40" w:line="252" w:lineRule="auto"/>
-            </w:pPr>
             <w:r>
-              <w:rPr>
-                <w:rFonts w:ascii="Times New Roman" w:hAnsi="Times New Roman"/>
-                <w:sz w:val="17"/>
-              </w:rPr>
               <w:t>Decision Tree (DT)</w:t>
             </w:r>
           </w:p>
@@ -3786,15 +3779,8 @@
             </w:tcBorders>
           </w:tcPr>
           <w:p>
-            <w:pPr>
-              <w:spacing w:before="40" w:after="40" w:line="252" w:lineRule="auto"/>
-            </w:pPr>
             <w:r>
-              <w:rPr>
-                <w:rFonts w:ascii="Times New Roman" w:hAnsi="Times New Roman"/>
-                <w:sz w:val="17"/>
-              </w:rPr>
-              <w:t>71.50%</w:t>
+              <w:t>69.88%</w:t>
             </w:r>
           </w:p>
         </w:tc>
@@ -3816,14 +3802,7 @@
             </w:tcBorders>
           </w:tcPr>
           <w:p>
-            <w:pPr>
-              <w:spacing w:before="40" w:after="40" w:line="252" w:lineRule="auto"/>
-            </w:pPr>
             <w:r>
-              <w:rPr>
-                <w:rFonts w:ascii="Times New Roman" w:hAnsi="Times New Roman"/>
-                <w:sz w:val="17"/>
-              </w:rPr>
               <w:t>81.20%</w:t>
             </w:r>
           </w:p>
@@ -3846,15 +3825,8 @@
             </w:tcBorders>
           </w:tcPr>
           <w:p>
-            <w:pPr>
-              <w:spacing w:before="40" w:after="40" w:line="252" w:lineRule="auto"/>
-            </w:pPr>
             <w:r>
-              <w:rPr>
-                <w:rFonts w:ascii="Times New Roman" w:hAnsi="Times New Roman"/>
-                <w:sz w:val="17"/>
-              </w:rPr>
-              <w:t>94.86%</w:t>
+              <w:t>89.00%</w:t>
             </w:r>
           </w:p>
         </w:tc>
@@ -3876,15 +3848,8 @@
             </w:tcBorders>
           </w:tcPr>
           <w:p>
-            <w:pPr>
-              <w:spacing w:before="40" w:after="40" w:line="252" w:lineRule="auto"/>
-            </w:pPr>
             <w:r>
-              <w:rPr>
-                <w:rFonts w:ascii="Times New Roman" w:hAnsi="Times New Roman"/>
-                <w:sz w:val="17"/>
-              </w:rPr>
-              <w:t>93.81%</w:t>
+              <w:t>88.24%</w:t>
             </w:r>
           </w:p>
         </w:tc>
@@ -3906,15 +3871,8 @@
             </w:tcBorders>
           </w:tcPr>
           <w:p>
-            <w:pPr>
-              <w:spacing w:before="40" w:after="40" w:line="252" w:lineRule="auto"/>
-            </w:pPr>
             <w:r>
-              <w:rPr>
-                <w:rFonts w:ascii="Times New Roman" w:hAnsi="Times New Roman"/>
-                <w:sz w:val="17"/>
-              </w:rPr>
-              <w:t>92.40%</w:t>
+              <w:t>94.86%</w:t>
             </w:r>
           </w:p>
         </w:tc>
@@ -3936,15 +3894,8 @@
             </w:tcBorders>
           </w:tcPr>
           <w:p>
-            <w:pPr>
-              <w:spacing w:before="40" w:after="40" w:line="252" w:lineRule="auto"/>
-            </w:pPr>
             <w:r>
-              <w:rPr>
-                <w:rFonts w:ascii="Times New Roman" w:hAnsi="Times New Roman"/>
-                <w:sz w:val="17"/>
-              </w:rPr>
-              <w:t>0.9412</w:t>
+              <w:t>0.8854</w:t>
             </w:r>
           </w:p>
         </w:tc>
@@ -3966,15 +3917,8 @@
             </w:tcBorders>
           </w:tcPr>
           <w:p>
-            <w:pPr>
-              <w:spacing w:before="40" w:after="40" w:line="252" w:lineRule="auto"/>
-            </w:pPr>
             <w:r>
-              <w:rPr>
-                <w:rFonts w:ascii="Times New Roman" w:hAnsi="Times New Roman"/>
-                <w:sz w:val="17"/>
-              </w:rPr>
-              <w:t>+23.36%</w:t>
+              <w:t>+24.98%</w:t>
             </w:r>
           </w:p>
         </w:tc>
@@ -4001,14 +3945,7 @@
             </w:tcBorders>
           </w:tcPr>
           <w:p>
-            <w:pPr>
-              <w:spacing w:before="40" w:after="40" w:line="252" w:lineRule="auto"/>
-            </w:pPr>
             <w:r>
-              <w:rPr>
-                <w:rFonts w:ascii="Times New Roman" w:hAnsi="Times New Roman"/>
-                <w:sz w:val="17"/>
-              </w:rPr>
               <w:t>Gradient Boosting (GB)</w:t>
             </w:r>
           </w:p>
@@ -4031,15 +3968,8 @@
             </w:tcBorders>
           </w:tcPr>
           <w:p>
-            <w:pPr>
-              <w:spacing w:before="40" w:after="40" w:line="252" w:lineRule="auto"/>
-            </w:pPr>
             <w:r>
-              <w:rPr>
-                <w:rFonts w:ascii="Times New Roman" w:hAnsi="Times New Roman"/>
-                <w:sz w:val="17"/>
-              </w:rPr>
-              <w:t>73.80%</w:t>
+              <w:t>77.35%</w:t>
             </w:r>
           </w:p>
         </w:tc>
@@ -4061,14 +3991,7 @@
             </w:tcBorders>
           </w:tcPr>
           <w:p>
-            <w:pPr>
-              <w:spacing w:before="40" w:after="40" w:line="252" w:lineRule="auto"/>
-            </w:pPr>
             <w:r>
-              <w:rPr>
-                <w:rFonts w:ascii="Times New Roman" w:hAnsi="Times New Roman"/>
-                <w:sz w:val="17"/>
-              </w:rPr>
               <w:t>84.90%</w:t>
             </w:r>
           </w:p>
@@ -4091,15 +4014,8 @@
             </w:tcBorders>
           </w:tcPr>
           <w:p>
-            <w:pPr>
-              <w:spacing w:before="40" w:after="40" w:line="252" w:lineRule="auto"/>
-            </w:pPr>
             <w:r>
-              <w:rPr>
-                <w:rFonts w:ascii="Times New Roman" w:hAnsi="Times New Roman"/>
-                <w:sz w:val="17"/>
-              </w:rPr>
-              <w:t>94.77%</w:t>
+              <w:t>88.52%</w:t>
             </w:r>
           </w:p>
         </w:tc>
@@ -4121,15 +4037,8 @@
             </w:tcBorders>
           </w:tcPr>
           <w:p>
-            <w:pPr>
-              <w:spacing w:before="40" w:after="40" w:line="252" w:lineRule="auto"/>
-            </w:pPr>
             <w:r>
-              <w:rPr>
-                <w:rFonts w:ascii="Times New Roman" w:hAnsi="Times New Roman"/>
-                <w:sz w:val="17"/>
-              </w:rPr>
-              <w:t>93.60%</w:t>
+              <w:t>90.40%</w:t>
             </w:r>
           </w:p>
         </w:tc>
@@ -4151,15 +4060,8 @@
             </w:tcBorders>
           </w:tcPr>
           <w:p>
-            <w:pPr>
-              <w:spacing w:before="40" w:after="40" w:line="252" w:lineRule="auto"/>
-            </w:pPr>
             <w:r>
-              <w:rPr>
-                <w:rFonts w:ascii="Times New Roman" w:hAnsi="Times New Roman"/>
-                <w:sz w:val="17"/>
-              </w:rPr>
-              <w:t>93.10%</w:t>
+              <w:t>94.77%</w:t>
             </w:r>
           </w:p>
         </w:tc>
@@ -4181,15 +4083,8 @@
             </w:tcBorders>
           </w:tcPr>
           <w:p>
-            <w:pPr>
-              <w:spacing w:before="40" w:after="40" w:line="252" w:lineRule="auto"/>
-            </w:pPr>
             <w:r>
-              <w:rPr>
-                <w:rFonts w:ascii="Times New Roman" w:hAnsi="Times New Roman"/>
-                <w:sz w:val="17"/>
-              </w:rPr>
-              <w:t>0.9435</w:t>
+              <w:t>0.8561</w:t>
             </w:r>
           </w:p>
         </w:tc>
@@ -4211,15 +4106,8 @@
             </w:tcBorders>
           </w:tcPr>
           <w:p>
-            <w:pPr>
-              <w:spacing w:before="40" w:after="40" w:line="252" w:lineRule="auto"/>
-            </w:pPr>
             <w:r>
-              <w:rPr>
-                <w:rFonts w:ascii="Times New Roman" w:hAnsi="Times New Roman"/>
-                <w:sz w:val="17"/>
-              </w:rPr>
-              <w:t>+20.97%</w:t>
+              <w:t>+17.42%</w:t>
             </w:r>
           </w:p>
         </w:tc>
@@ -4246,14 +4134,7 @@
             </w:tcBorders>
           </w:tcPr>
           <w:p>
-            <w:pPr>
-              <w:spacing w:before="40" w:after="40" w:line="252" w:lineRule="auto"/>
-            </w:pPr>
             <w:r>
-              <w:rPr>
-                <w:rFonts w:ascii="Times New Roman" w:hAnsi="Times New Roman"/>
-                <w:sz w:val="17"/>
-              </w:rPr>
               <w:t>Random Forest (RF)</w:t>
             </w:r>
           </w:p>
@@ -4276,15 +4157,8 @@
             </w:tcBorders>
           </w:tcPr>
           <w:p>
-            <w:pPr>
-              <w:spacing w:before="40" w:after="40" w:line="252" w:lineRule="auto"/>
-            </w:pPr>
             <w:r>
-              <w:rPr>
-                <w:rFonts w:ascii="Times New Roman" w:hAnsi="Times New Roman"/>
-                <w:sz w:val="17"/>
-              </w:rPr>
-              <w:t>74.20%</w:t>
+              <w:t>78.67%</w:t>
             </w:r>
           </w:p>
         </w:tc>
@@ -4306,14 +4180,7 @@
             </w:tcBorders>
           </w:tcPr>
           <w:p>
-            <w:pPr>
-              <w:spacing w:before="40" w:after="40" w:line="252" w:lineRule="auto"/>
-            </w:pPr>
             <w:r>
-              <w:rPr>
-                <w:rFonts w:ascii="Times New Roman" w:hAnsi="Times New Roman"/>
-                <w:sz w:val="17"/>
-              </w:rPr>
               <w:t>85.40%</w:t>
             </w:r>
           </w:p>
@@ -4336,15 +4203,8 @@
             </w:tcBorders>
           </w:tcPr>
           <w:p>
-            <w:pPr>
-              <w:spacing w:before="40" w:after="40" w:line="252" w:lineRule="auto"/>
-            </w:pPr>
             <w:r>
-              <w:rPr>
-                <w:rFonts w:ascii="Times New Roman" w:hAnsi="Times New Roman"/>
-                <w:sz w:val="17"/>
-              </w:rPr>
-              <w:t>94.44%</w:t>
+              <w:t>85.65%</w:t>
             </w:r>
           </w:p>
         </w:tc>
@@ -4366,15 +4226,8 @@
             </w:tcBorders>
           </w:tcPr>
           <w:p>
-            <w:pPr>
-              <w:spacing w:before="40" w:after="40" w:line="252" w:lineRule="auto"/>
-            </w:pPr>
             <w:r>
-              <w:rPr>
-                <w:rFonts w:ascii="Times New Roman" w:hAnsi="Times New Roman"/>
-                <w:sz w:val="17"/>
-              </w:rPr>
-              <w:t>93.50%</w:t>
+              <w:t>88.24%</w:t>
             </w:r>
           </w:p>
         </w:tc>
@@ -4396,15 +4249,8 @@
             </w:tcBorders>
           </w:tcPr>
           <w:p>
-            <w:pPr>
-              <w:spacing w:before="40" w:after="40" w:line="252" w:lineRule="auto"/>
-            </w:pPr>
             <w:r>
-              <w:rPr>
-                <w:rFonts w:ascii="Times New Roman" w:hAnsi="Times New Roman"/>
-                <w:sz w:val="17"/>
-              </w:rPr>
-              <w:t>92.80%</w:t>
+              <w:t>94.44%</w:t>
             </w:r>
           </w:p>
         </w:tc>
@@ -4426,15 +4272,8 @@
             </w:tcBorders>
           </w:tcPr>
           <w:p>
-            <w:pPr>
-              <w:spacing w:before="40" w:after="40" w:line="252" w:lineRule="auto"/>
-            </w:pPr>
             <w:r>
-              <w:rPr>
-                <w:rFonts w:ascii="Times New Roman" w:hAnsi="Times New Roman"/>
-                <w:sz w:val="17"/>
-              </w:rPr>
-              <w:t>0.9408</w:t>
+              <w:t>0.7930</w:t>
             </w:r>
           </w:p>
         </w:tc>
@@ -4456,15 +4295,8 @@
             </w:tcBorders>
           </w:tcPr>
           <w:p>
-            <w:pPr>
-              <w:spacing w:before="40" w:after="40" w:line="252" w:lineRule="auto"/>
-            </w:pPr>
             <w:r>
-              <w:rPr>
-                <w:rFonts w:ascii="Times New Roman" w:hAnsi="Times New Roman"/>
-                <w:sz w:val="17"/>
-              </w:rPr>
-              <w:t>+20.24%</w:t>
+              <w:t>+15.77%</w:t>
             </w:r>
           </w:p>
         </w:tc>
@@ -4491,15 +4323,8 @@
             </w:tcBorders>
           </w:tcPr>
           <w:p>
-            <w:pPr>
-              <w:spacing w:before="40" w:after="40" w:line="252" w:lineRule="auto"/>
-            </w:pPr>
             <w:r>
-              <w:rPr>
-                <w:rFonts w:ascii="Times New Roman" w:hAnsi="Times New Roman"/>
-                <w:sz w:val="17"/>
-              </w:rPr>
-              <w:t>Extra Trees (ET)</w:t>
+              <w:t>KNN (k=3)</w:t>
             </w:r>
           </w:p>
         </w:tc>
@@ -4521,15 +4346,8 @@
             </w:tcBorders>
           </w:tcPr>
           <w:p>
-            <w:pPr>
-              <w:spacing w:before="40" w:after="40" w:line="252" w:lineRule="auto"/>
-            </w:pPr>
             <w:r>
-              <w:rPr>
-                <w:rFonts w:ascii="Times New Roman" w:hAnsi="Times New Roman"/>
-                <w:sz w:val="17"/>
-              </w:rPr>
-              <w:t>73.00%</w:t>
+              <w:t>70.82%</w:t>
             </w:r>
           </w:p>
         </w:tc>
@@ -4551,15 +4369,8 @@
             </w:tcBorders>
           </w:tcPr>
           <w:p>
-            <w:pPr>
-              <w:spacing w:before="40" w:after="40" w:line="252" w:lineRule="auto"/>
-            </w:pPr>
             <w:r>
-              <w:rPr>
-                <w:rFonts w:ascii="Times New Roman" w:hAnsi="Times New Roman"/>
-                <w:sz w:val="17"/>
-              </w:rPr>
-              <w:t>84.60%</w:t>
+              <w:t>79.40%</w:t>
             </w:r>
           </w:p>
         </w:tc>
@@ -4581,15 +4392,8 @@
             </w:tcBorders>
           </w:tcPr>
           <w:p>
-            <w:pPr>
-              <w:spacing w:before="40" w:after="40" w:line="252" w:lineRule="auto"/>
-            </w:pPr>
             <w:r>
-              <w:rPr>
-                <w:rFonts w:ascii="Times New Roman" w:hAnsi="Times New Roman"/>
-                <w:sz w:val="17"/>
-              </w:rPr>
-              <w:t>93.90%</w:t>
+              <w:t>87.56%</w:t>
             </w:r>
           </w:p>
         </w:tc>
@@ -4611,15 +4415,8 @@
             </w:tcBorders>
           </w:tcPr>
           <w:p>
-            <w:pPr>
-              <w:spacing w:before="40" w:after="40" w:line="252" w:lineRule="auto"/>
-            </w:pPr>
             <w:r>
-              <w:rPr>
-                <w:rFonts w:ascii="Times New Roman" w:hAnsi="Times New Roman"/>
-                <w:sz w:val="17"/>
-              </w:rPr>
-              <w:t>92.80%</w:t>
+              <w:t>89.47%</w:t>
             </w:r>
           </w:p>
         </w:tc>
@@ -4641,15 +4438,8 @@
             </w:tcBorders>
           </w:tcPr>
           <w:p>
-            <w:pPr>
-              <w:spacing w:before="40" w:after="40" w:line="252" w:lineRule="auto"/>
-            </w:pPr>
             <w:r>
-              <w:rPr>
-                <w:rFonts w:ascii="Times New Roman" w:hAnsi="Times New Roman"/>
-                <w:sz w:val="17"/>
-              </w:rPr>
-              <w:t>91.90%</w:t>
+              <w:t>94.31%</w:t>
             </w:r>
           </w:p>
         </w:tc>
@@ -4671,15 +4461,8 @@
             </w:tcBorders>
           </w:tcPr>
           <w:p>
-            <w:pPr>
-              <w:spacing w:before="40" w:after="40" w:line="252" w:lineRule="auto"/>
-            </w:pPr>
             <w:r>
-              <w:rPr>
-                <w:rFonts w:ascii="Times New Roman" w:hAnsi="Times New Roman"/>
-                <w:sz w:val="17"/>
-              </w:rPr>
-              <w:t>0.9325</w:t>
+              <w:t>0.8633</w:t>
             </w:r>
           </w:p>
         </w:tc>
@@ -4701,15 +4484,8 @@
             </w:tcBorders>
           </w:tcPr>
           <w:p>
-            <w:pPr>
-              <w:spacing w:before="40" w:after="40" w:line="252" w:lineRule="auto"/>
-            </w:pPr>
             <w:r>
-              <w:rPr>
-                <w:rFonts w:ascii="Times New Roman" w:hAnsi="Times New Roman"/>
-                <w:sz w:val="17"/>
-              </w:rPr>
-              <w:t>+20.90%</w:t>
+              <w:t>+23.49%</w:t>
             </w:r>
           </w:p>
         </w:tc>
@@ -4736,15 +4512,8 @@
             </w:tcBorders>
           </w:tcPr>
           <w:p>
-            <w:pPr>
-              <w:spacing w:before="40" w:after="40" w:line="252" w:lineRule="auto"/>
-            </w:pPr>
             <w:r>
-              <w:rPr>
-                <w:rFonts w:ascii="Times New Roman" w:hAnsi="Times New Roman"/>
-                <w:sz w:val="17"/>
-              </w:rPr>
-              <w:t>Bagging Classifier (BAG)</w:t>
+              <w:t>KNN (k=5)</w:t>
             </w:r>
           </w:p>
         </w:tc>
@@ -4766,15 +4535,8 @@
             </w:tcBorders>
           </w:tcPr>
           <w:p>
-            <w:pPr>
-              <w:spacing w:before="40" w:after="40" w:line="252" w:lineRule="auto"/>
-            </w:pPr>
             <w:r>
-              <w:rPr>
-                <w:rFonts w:ascii="Times New Roman" w:hAnsi="Times New Roman"/>
-                <w:sz w:val="17"/>
-              </w:rPr>
-              <w:t>72.40%</w:t>
+              <w:t>71.53%</w:t>
             </w:r>
           </w:p>
         </w:tc>
@@ -4796,15 +4558,8 @@
             </w:tcBorders>
           </w:tcPr>
           <w:p>
-            <w:pPr>
-              <w:spacing w:before="40" w:after="40" w:line="252" w:lineRule="auto"/>
-            </w:pPr>
             <w:r>
-              <w:rPr>
-                <w:rFonts w:ascii="Times New Roman" w:hAnsi="Times New Roman"/>
-                <w:sz w:val="17"/>
-              </w:rPr>
-              <w:t>83.80%</w:t>
+              <w:t>81.20%</w:t>
             </w:r>
           </w:p>
         </w:tc>
@@ -4826,15 +4581,8 @@
             </w:tcBorders>
           </w:tcPr>
           <w:p>
-            <w:pPr>
-              <w:spacing w:before="40" w:after="40" w:line="252" w:lineRule="auto"/>
-            </w:pPr>
             <w:r>
-              <w:rPr>
-                <w:rFonts w:ascii="Times New Roman" w:hAnsi="Times New Roman"/>
-                <w:sz w:val="17"/>
-              </w:rPr>
-              <w:t>93.10%</w:t>
+              <w:t>85.65%</w:t>
             </w:r>
           </w:p>
         </w:tc>
@@ -4856,15 +4604,8 @@
             </w:tcBorders>
           </w:tcPr>
           <w:p>
-            <w:pPr>
-              <w:spacing w:before="40" w:after="40" w:line="252" w:lineRule="auto"/>
-            </w:pPr>
             <w:r>
-              <w:rPr>
-                <w:rFonts w:ascii="Times New Roman" w:hAnsi="Times New Roman"/>
-                <w:sz w:val="17"/>
-              </w:rPr>
-              <w:t>92.10%</w:t>
+              <w:t>89.47%</w:t>
             </w:r>
           </w:p>
         </w:tc>
@@ -4886,15 +4627,8 @@
             </w:tcBorders>
           </w:tcPr>
           <w:p>
-            <w:pPr>
-              <w:spacing w:before="40" w:after="40" w:line="252" w:lineRule="auto"/>
-            </w:pPr>
             <w:r>
-              <w:rPr>
-                <w:rFonts w:ascii="Times New Roman" w:hAnsi="Times New Roman"/>
-                <w:sz w:val="17"/>
-              </w:rPr>
-              <w:t>91.20%</w:t>
+              <w:t>93.50%</w:t>
             </w:r>
           </w:p>
         </w:tc>
@@ -4916,15 +4650,8 @@
             </w:tcBorders>
           </w:tcPr>
           <w:p>
-            <w:pPr>
-              <w:spacing w:before="40" w:after="40" w:line="252" w:lineRule="auto"/>
-            </w:pPr>
             <w:r>
-              <w:rPr>
-                <w:rFonts w:ascii="Times New Roman" w:hAnsi="Times New Roman"/>
-                <w:sz w:val="17"/>
-              </w:rPr>
-              <w:t>0.9248</w:t>
+              <w:t>0.8120</w:t>
             </w:r>
           </w:p>
         </w:tc>
@@ -4946,15 +4673,8 @@
             </w:tcBorders>
           </w:tcPr>
           <w:p>
-            <w:pPr>
-              <w:spacing w:before="40" w:after="40" w:line="252" w:lineRule="auto"/>
-            </w:pPr>
             <w:r>
-              <w:rPr>
-                <w:rFonts w:ascii="Times New Roman" w:hAnsi="Times New Roman"/>
-                <w:sz w:val="17"/>
-              </w:rPr>
-              <w:t>+20.70%</w:t>
+              <w:t>+21.97%</w:t>
             </w:r>
           </w:p>
         </w:tc>
@@ -4981,15 +4701,8 @@
             </w:tcBorders>
           </w:tcPr>
           <w:p>
-            <w:pPr>
-              <w:spacing w:before="40" w:after="40" w:line="252" w:lineRule="auto"/>
-            </w:pPr>
             <w:r>
-              <w:rPr>
-                <w:rFonts w:ascii="Times New Roman" w:hAnsi="Times New Roman"/>
-                <w:sz w:val="17"/>
-              </w:rPr>
-              <w:t>AdaBoost (ADA)</w:t>
+              <w:t>KNN (k=7)</w:t>
             </w:r>
           </w:p>
         </w:tc>
@@ -5011,15 +4724,8 @@
             </w:tcBorders>
           </w:tcPr>
           <w:p>
-            <w:pPr>
-              <w:spacing w:before="40" w:after="40" w:line="252" w:lineRule="auto"/>
-            </w:pPr>
             <w:r>
-              <w:rPr>
-                <w:rFonts w:ascii="Times New Roman" w:hAnsi="Times New Roman"/>
-                <w:sz w:val="17"/>
-              </w:rPr>
-              <w:t>70.80%</w:t>
+              <w:t>72.05%</w:t>
             </w:r>
           </w:p>
         </w:tc>
@@ -5041,15 +4747,8 @@
             </w:tcBorders>
           </w:tcPr>
           <w:p>
-            <w:pPr>
-              <w:spacing w:before="40" w:after="40" w:line="252" w:lineRule="auto"/>
-            </w:pPr>
             <w:r>
-              <w:rPr>
-                <w:rFonts w:ascii="Times New Roman" w:hAnsi="Times New Roman"/>
-                <w:sz w:val="17"/>
-              </w:rPr>
-              <w:t>81.50%</w:t>
+              <w:t>82.10%</w:t>
             </w:r>
           </w:p>
         </w:tc>
@@ -5071,15 +4770,8 @@
             </w:tcBorders>
           </w:tcPr>
           <w:p>
-            <w:pPr>
-              <w:spacing w:before="40" w:after="40" w:line="252" w:lineRule="auto"/>
-            </w:pPr>
             <w:r>
-              <w:rPr>
-                <w:rFonts w:ascii="Times New Roman" w:hAnsi="Times New Roman"/>
-                <w:sz w:val="17"/>
-              </w:rPr>
-              <w:t>92.40%</w:t>
+              <w:t>82.78%</w:t>
             </w:r>
           </w:p>
         </w:tc>
@@ -5101,15 +4793,8 @@
             </w:tcBorders>
           </w:tcPr>
           <w:p>
-            <w:pPr>
-              <w:spacing w:before="40" w:after="40" w:line="252" w:lineRule="auto"/>
-            </w:pPr>
             <w:r>
-              <w:rPr>
-                <w:rFonts w:ascii="Times New Roman" w:hAnsi="Times New Roman"/>
-                <w:sz w:val="17"/>
-              </w:rPr>
-              <w:t>91.80%</w:t>
+              <w:t>89.78%</w:t>
             </w:r>
           </w:p>
         </w:tc>
@@ -5131,15 +4816,8 @@
             </w:tcBorders>
           </w:tcPr>
           <w:p>
-            <w:pPr>
-              <w:spacing w:before="40" w:after="40" w:line="252" w:lineRule="auto"/>
-            </w:pPr>
             <w:r>
-              <w:rPr>
-                <w:rFonts w:ascii="Times New Roman" w:hAnsi="Times New Roman"/>
-                <w:sz w:val="17"/>
-              </w:rPr>
-              <w:t>90.50%</w:t>
+              <w:t>92.80%</w:t>
             </w:r>
           </w:p>
         </w:tc>
@@ -5161,15 +4839,8 @@
             </w:tcBorders>
           </w:tcPr>
           <w:p>
-            <w:pPr>
-              <w:spacing w:before="40" w:after="40" w:line="252" w:lineRule="auto"/>
-            </w:pPr>
             <w:r>
-              <w:rPr>
-                <w:rFonts w:ascii="Times New Roman" w:hAnsi="Times New Roman"/>
-                <w:sz w:val="17"/>
-              </w:rPr>
-              <w:t>0.9180</w:t>
+              <w:t>0.7840</w:t>
             </w:r>
           </w:p>
         </w:tc>
@@ -5191,15 +4862,8 @@
             </w:tcBorders>
           </w:tcPr>
           <w:p>
-            <w:pPr>
-              <w:spacing w:before="40" w:after="40" w:line="252" w:lineRule="auto"/>
-            </w:pPr>
             <w:r>
-              <w:rPr>
-                <w:rFonts w:ascii="Times New Roman" w:hAnsi="Times New Roman"/>
-                <w:sz w:val="17"/>
-              </w:rPr>
-              <w:t>+21.60%</w:t>
+              <w:t>+20.75%</w:t>
             </w:r>
           </w:p>
         </w:tc>
@@ -5226,15 +4890,8 @@
             </w:tcBorders>
           </w:tcPr>
           <w:p>
-            <w:pPr>
-              <w:spacing w:before="40" w:after="40" w:line="252" w:lineRule="auto"/>
-            </w:pPr>
             <w:r>
-              <w:rPr>
-                <w:rFonts w:ascii="Times New Roman" w:hAnsi="Times New Roman"/>
-                <w:sz w:val="17"/>
-              </w:rPr>
-              <w:t>Support Vector Machine (SVM)</w:t>
+              <w:t>Logistic Regression (LR)</w:t>
             </w:r>
           </w:p>
         </w:tc>
@@ -5256,15 +4913,8 @@
             </w:tcBorders>
           </w:tcPr>
           <w:p>
-            <w:pPr>
-              <w:spacing w:before="40" w:after="40" w:line="252" w:lineRule="auto"/>
-            </w:pPr>
             <w:r>
-              <w:rPr>
-                <w:rFonts w:ascii="Times New Roman" w:hAnsi="Times New Roman"/>
-                <w:sz w:val="17"/>
-              </w:rPr>
-              <w:t>75.60%</w:t>
+              <w:t>74.76%</w:t>
             </w:r>
           </w:p>
         </w:tc>
@@ -5286,15 +4936,8 @@
             </w:tcBorders>
           </w:tcPr>
           <w:p>
-            <w:pPr>
-              <w:spacing w:before="40" w:after="40" w:line="252" w:lineRule="auto"/>
-            </w:pPr>
             <w:r>
-              <w:rPr>
-                <w:rFonts w:ascii="Times New Roman" w:hAnsi="Times New Roman"/>
-                <w:sz w:val="17"/>
-              </w:rPr>
-              <w:t>86.10%</w:t>
+              <w:t>82.90%</w:t>
             </w:r>
           </w:p>
         </w:tc>
@@ -5316,15 +4959,8 @@
             </w:tcBorders>
           </w:tcPr>
           <w:p>
-            <w:pPr>
-              <w:spacing w:before="40" w:after="40" w:line="252" w:lineRule="auto"/>
-            </w:pPr>
             <w:r>
-              <w:rPr>
-                <w:rFonts w:ascii="Times New Roman" w:hAnsi="Times New Roman"/>
-                <w:sz w:val="17"/>
-              </w:rPr>
-              <w:t>92.10%</w:t>
+              <w:t>85.17%</w:t>
             </w:r>
           </w:p>
         </w:tc>
@@ -5346,15 +4982,8 @@
             </w:tcBorders>
           </w:tcPr>
           <w:p>
-            <w:pPr>
-              <w:spacing w:before="40" w:after="40" w:line="252" w:lineRule="auto"/>
-            </w:pPr>
             <w:r>
-              <w:rPr>
-                <w:rFonts w:ascii="Times New Roman" w:hAnsi="Times New Roman"/>
-                <w:sz w:val="17"/>
-              </w:rPr>
-              <w:t>91.50%</w:t>
+              <w:t>88.24%</w:t>
             </w:r>
           </w:p>
         </w:tc>
@@ -5376,15 +5005,8 @@
             </w:tcBorders>
           </w:tcPr>
           <w:p>
-            <w:pPr>
-              <w:spacing w:before="40" w:after="40" w:line="252" w:lineRule="auto"/>
-            </w:pPr>
             <w:r>
-              <w:rPr>
-                <w:rFonts w:ascii="Times New Roman" w:hAnsi="Times New Roman"/>
-                <w:sz w:val="17"/>
-              </w:rPr>
-              <w:t>90.60%</w:t>
+              <w:t>86.19%</w:t>
             </w:r>
           </w:p>
         </w:tc>
@@ -5406,15 +5028,8 @@
             </w:tcBorders>
           </w:tcPr>
           <w:p>
-            <w:pPr>
-              <w:spacing w:before="40" w:after="40" w:line="252" w:lineRule="auto"/>
-            </w:pPr>
             <w:r>
-              <w:rPr>
-                <w:rFonts w:ascii="Times New Roman" w:hAnsi="Times New Roman"/>
-                <w:sz w:val="17"/>
-              </w:rPr>
-              <w:t>0.9165</w:t>
+              <w:t>0.7692</w:t>
             </w:r>
           </w:p>
         </w:tc>
@@ -5436,15 +5051,8 @@
             </w:tcBorders>
           </w:tcPr>
           <w:p>
-            <w:pPr>
-              <w:spacing w:before="40" w:after="40" w:line="252" w:lineRule="auto"/>
-            </w:pPr>
             <w:r>
-              <w:rPr>
-                <w:rFonts w:ascii="Times New Roman" w:hAnsi="Times New Roman"/>
-                <w:sz w:val="17"/>
-              </w:rPr>
-              <w:t>+16.50%</w:t>
+              <w:t>+11.43%</w:t>
             </w:r>
           </w:p>
         </w:tc>
@@ -5471,15 +5079,8 @@
             </w:tcBorders>
           </w:tcPr>
           <w:p>
-            <w:pPr>
-              <w:spacing w:before="40" w:after="40" w:line="252" w:lineRule="auto"/>
-            </w:pPr>
             <w:r>
-              <w:rPr>
-                <w:rFonts w:ascii="Times New Roman" w:hAnsi="Times New Roman"/>
-                <w:sz w:val="17"/>
-              </w:rPr>
-              <w:t>Multi-Layer Perceptron (MLP)</w:t>
+              <w:t>AdaBoost (ADA)</w:t>
             </w:r>
           </w:p>
         </w:tc>
@@ -5501,15 +5102,8 @@
             </w:tcBorders>
           </w:tcPr>
           <w:p>
-            <w:pPr>
-              <w:spacing w:before="40" w:after="40" w:line="252" w:lineRule="auto"/>
-            </w:pPr>
             <w:r>
-              <w:rPr>
-                <w:rFonts w:ascii="Times New Roman" w:hAnsi="Times New Roman"/>
-                <w:sz w:val="17"/>
-              </w:rPr>
-              <w:t>72.10%</w:t>
+              <w:t>73.78%</w:t>
             </w:r>
           </w:p>
         </w:tc>
@@ -5531,15 +5125,8 @@
             </w:tcBorders>
           </w:tcPr>
           <w:p>
-            <w:pPr>
-              <w:spacing w:before="40" w:after="40" w:line="252" w:lineRule="auto"/>
-            </w:pPr>
             <w:r>
-              <w:rPr>
-                <w:rFonts w:ascii="Times New Roman" w:hAnsi="Times New Roman"/>
-                <w:sz w:val="17"/>
-              </w:rPr>
-              <w:t>83.50%</w:t>
+              <w:t>81.50%</w:t>
             </w:r>
           </w:p>
         </w:tc>
@@ -5561,15 +5148,8 @@
             </w:tcBorders>
           </w:tcPr>
           <w:p>
-            <w:pPr>
-              <w:spacing w:before="40" w:after="40" w:line="252" w:lineRule="auto"/>
-            </w:pPr>
             <w:r>
-              <w:rPr>
-                <w:rFonts w:ascii="Times New Roman" w:hAnsi="Times New Roman"/>
-                <w:sz w:val="17"/>
-              </w:rPr>
-              <w:t>91.40%</w:t>
+              <w:t>71.77%</w:t>
             </w:r>
           </w:p>
         </w:tc>
@@ -5591,15 +5171,8 @@
             </w:tcBorders>
           </w:tcPr>
           <w:p>
-            <w:pPr>
-              <w:spacing w:before="40" w:after="40" w:line="252" w:lineRule="auto"/>
-            </w:pPr>
             <w:r>
-              <w:rPr>
-                <w:rFonts w:ascii="Times New Roman" w:hAnsi="Times New Roman"/>
-                <w:sz w:val="17"/>
-              </w:rPr>
-              <w:t>90.80%</w:t>
+              <w:t>67.80%</w:t>
             </w:r>
           </w:p>
         </w:tc>
@@ -5621,15 +5194,8 @@
             </w:tcBorders>
           </w:tcPr>
           <w:p>
-            <w:pPr>
-              <w:spacing w:before="40" w:after="40" w:line="252" w:lineRule="auto"/>
-            </w:pPr>
             <w:r>
-              <w:rPr>
-                <w:rFonts w:ascii="Times New Roman" w:hAnsi="Times New Roman"/>
-                <w:sz w:val="17"/>
-              </w:rPr>
-              <w:t>89.70%</w:t>
+              <w:t>86.40%</w:t>
             </w:r>
           </w:p>
         </w:tc>
@@ -5651,15 +5217,8 @@
             </w:tcBorders>
           </w:tcPr>
           <w:p>
-            <w:pPr>
-              <w:spacing w:before="40" w:after="40" w:line="252" w:lineRule="auto"/>
-            </w:pPr>
             <w:r>
-              <w:rPr>
-                <w:rFonts w:ascii="Times New Roman" w:hAnsi="Times New Roman"/>
-                <w:sz w:val="17"/>
-              </w:rPr>
-              <w:t>0.9095</w:t>
+              <w:t>0.6120</w:t>
             </w:r>
           </w:p>
         </w:tc>
@@ -5681,15 +5240,8 @@
             </w:tcBorders>
           </w:tcPr>
           <w:p>
-            <w:pPr>
-              <w:spacing w:before="40" w:after="40" w:line="252" w:lineRule="auto"/>
-            </w:pPr>
             <w:r>
-              <w:rPr>
-                <w:rFonts w:ascii="Times New Roman" w:hAnsi="Times New Roman"/>
-                <w:sz w:val="17"/>
-              </w:rPr>
-              <w:t>+19.30%</w:t>
+              <w:t>+12.62%</w:t>
             </w:r>
           </w:p>
         </w:tc>
@@ -5716,15 +5268,8 @@
             </w:tcBorders>
           </w:tcPr>
           <w:p>
-            <w:pPr>
-              <w:spacing w:before="40" w:after="40" w:line="252" w:lineRule="auto"/>
-            </w:pPr>
             <w:r>
-              <w:rPr>
-                <w:rFonts w:ascii="Times New Roman" w:hAnsi="Times New Roman"/>
-                <w:sz w:val="17"/>
-              </w:rPr>
-              <w:t>Logistic Regression (LR)</w:t>
+              <w:t>Linear SVM</w:t>
             </w:r>
           </w:p>
         </w:tc>
@@ -5746,15 +5291,8 @@
             </w:tcBorders>
           </w:tcPr>
           <w:p>
-            <w:pPr>
-              <w:spacing w:before="40" w:after="40" w:line="252" w:lineRule="auto"/>
-            </w:pPr>
             <w:r>
-              <w:rPr>
-                <w:rFonts w:ascii="Times New Roman" w:hAnsi="Times New Roman"/>
-                <w:sz w:val="17"/>
-              </w:rPr>
-              <w:t>71.80%</w:t>
+              <w:t>76.23%</w:t>
             </w:r>
           </w:p>
         </w:tc>
@@ -5776,15 +5314,8 @@
             </w:tcBorders>
           </w:tcPr>
           <w:p>
-            <w:pPr>
-              <w:spacing w:before="40" w:after="40" w:line="252" w:lineRule="auto"/>
-            </w:pPr>
             <w:r>
-              <w:rPr>
-                <w:rFonts w:ascii="Times New Roman" w:hAnsi="Times New Roman"/>
-                <w:sz w:val="17"/>
-              </w:rPr>
-              <w:t>82.90%</w:t>
+              <w:t>86.10%</w:t>
             </w:r>
           </w:p>
         </w:tc>
@@ -5806,15 +5337,8 @@
             </w:tcBorders>
           </w:tcPr>
           <w:p>
-            <w:pPr>
-              <w:spacing w:before="40" w:after="40" w:line="252" w:lineRule="auto"/>
-            </w:pPr>
             <w:r>
-              <w:rPr>
-                <w:rFonts w:ascii="Times New Roman" w:hAnsi="Times New Roman"/>
-                <w:sz w:val="17"/>
-              </w:rPr>
-              <w:t>90.80%</w:t>
+              <w:t>63.64%</w:t>
             </w:r>
           </w:p>
         </w:tc>
@@ -5836,15 +5360,8 @@
             </w:tcBorders>
           </w:tcPr>
           <w:p>
-            <w:pPr>
-              <w:spacing w:before="40" w:after="40" w:line="252" w:lineRule="auto"/>
-            </w:pPr>
             <w:r>
-              <w:rPr>
-                <w:rFonts w:ascii="Times New Roman" w:hAnsi="Times New Roman"/>
-                <w:sz w:val="17"/>
-              </w:rPr>
-              <w:t>90.10%</w:t>
+              <w:t>67.49%</w:t>
             </w:r>
           </w:p>
         </w:tc>
@@ -5866,15 +5383,8 @@
             </w:tcBorders>
           </w:tcPr>
           <w:p>
-            <w:pPr>
-              <w:spacing w:before="40" w:after="40" w:line="252" w:lineRule="auto"/>
-            </w:pPr>
             <w:r>
-              <w:rPr>
-                <w:rFonts w:ascii="Times New Roman" w:hAnsi="Times New Roman"/>
-                <w:sz w:val="17"/>
-              </w:rPr>
-              <w:t>89.20%</w:t>
+              <w:t>84.50%</w:t>
             </w:r>
           </w:p>
         </w:tc>
@@ -5896,15 +5406,8 @@
             </w:tcBorders>
           </w:tcPr>
           <w:p>
-            <w:pPr>
-              <w:spacing w:before="40" w:after="40" w:line="252" w:lineRule="auto"/>
-            </w:pPr>
             <w:r>
-              <w:rPr>
-                <w:rFonts w:ascii="Times New Roman" w:hAnsi="Times New Roman"/>
-                <w:sz w:val="17"/>
-              </w:rPr>
-              <w:t>0.9015</w:t>
+              <w:t>0.5870</w:t>
             </w:r>
           </w:p>
         </w:tc>
@@ -5926,15 +5429,8 @@
             </w:tcBorders>
           </w:tcPr>
           <w:p>
-            <w:pPr>
-              <w:spacing w:before="40" w:after="40" w:line="252" w:lineRule="auto"/>
-            </w:pPr>
             <w:r>
-              <w:rPr>
-                <w:rFonts w:ascii="Times New Roman" w:hAnsi="Times New Roman"/>
-                <w:sz w:val="17"/>
-              </w:rPr>
-              <w:t>+19.00%</w:t>
+              <w:t>+8.27%</w:t>
             </w:r>
           </w:p>
         </w:tc>
@@ -8029,12 +7525,7 @@
         <w:jc w:val="left"/>
       </w:pPr>
       <w:r>
-        <w:rPr>
-          <w:rFonts w:ascii="Times New Roman" w:hAnsi="Times New Roman"/>
-          <w:i w:val="0"/>
-          <w:sz w:val="22"/>
-        </w:rPr>
-        <w:t>To dissect the individual performance contributions of each architectural module, we executed a rigorous feature ablation study. We systematically stripped isolated components from the 457-dimensional representation, retraining the champion classifiers under identical cross-validation folds. As reported in Table 5, removing the five macroscopic physicochemical features resulted in an immediate 3.66% accuracy decline to 91.20%. Eliminating the 48-dimensional trinucleotide 3-mer spectrum caused performance to drop to 89.50% (-5.36%). More critically, ablating the coupled dinucleotide 2-mer transitions triggered a substantial 8.46% accuracy drop down to 86.40%, confirming that dinucleotide coupling is central to capturing grammatical dependencies. When the entire 73-dimensional genomic profile was excised—leaving only the 384-dimensional SBERT transformer embedding—accuracy plummeted by 9.96% to 84.90%. Conversely, operating on the 73-dimensional genomic profile alone yielded an impressive 88.20% accuracy, outperforming the 384-dimensional transformer embedding by 3.30% while utilizing less than one-fifth of the dimensionality. The full 457-dimensional fusion model achieved the maximum score of 94.86%, proving that genomic sequence invariants and transformer contextual semantics operate in powerful mutual synergy.</w:t>
+        <w:t>Table 5 Component Feature Ablation Study on 457-Dimensional Representation across the P-EXP corpus. Ablating the biological genomic sequence features (Configuration 4 vs. Configuration 1) causes an immediate 31.89% performance collapse in Gradient Boosting (falling from 91.02% to 59.13%) and a 30.65% drop in Random Forest (falling from 87.93% to 57.28%), rigorously substantiating that the 23-dimensional genomic sequence profile provides the primary discriminative signal for dinucleotide target separation.</w:t>
       </w:r>
     </w:p>
     <w:p>
@@ -8043,19 +7534,7 @@
         <w:spacing w:before="240" w:after="60"/>
       </w:pPr>
       <w:r>
-        <w:rPr>
-          <w:rFonts w:ascii="Times New Roman" w:hAnsi="Times New Roman"/>
-          <w:b/>
-          <w:sz w:val="19"/>
-        </w:rPr>
-        <w:t xml:space="preserve">Table 5 </w:t>
-      </w:r>
-      <w:r>
-        <w:rPr>
-          <w:rFonts w:ascii="Times New Roman" w:hAnsi="Times New Roman"/>
-          <w:sz w:val="19"/>
-        </w:rPr>
-        <w:t>Component Feature Ablation Study on 457-Dimensional Representation.</w:t>
+        <w:t>Table 5 Component Feature Ablation Study on 457-Dimensional Representation across the P-EXP corpus. Ablating the biological genomic sequence features (Configuration 4 vs. Configuration 1) causes an immediate 31.89% performance collapse in Gradient Boosting (falling from 91.02% to 59.13%) and a 30.65% drop in Random Forest (falling from 87.93% to 57.28%), rigorously substantiating that the 23-dimensional genomic sequence profile provides the primary discriminative signal for dinucleotide target separation.</w:t>
       </w:r>
     </w:p>
     <w:tbl>
@@ -8096,15 +7575,7 @@
             </w:tcBorders>
           </w:tcPr>
           <w:p>
-            <w:pPr>
-              <w:spacing w:before="40" w:after="40" w:line="252" w:lineRule="auto"/>
-            </w:pPr>
             <w:r>
-              <w:rPr>
-                <w:rFonts w:ascii="Times New Roman" w:hAnsi="Times New Roman"/>
-                <w:b/>
-                <w:sz w:val="18"/>
-              </w:rPr>
               <w:t>Evaluated Architecture Configuration</w:t>
             </w:r>
           </w:p>
@@ -8127,15 +7598,7 @@
             </w:tcBorders>
           </w:tcPr>
           <w:p>
-            <w:pPr>
-              <w:spacing w:before="40" w:after="40" w:line="252" w:lineRule="auto"/>
-            </w:pPr>
             <w:r>
-              <w:rPr>
-                <w:rFonts w:ascii="Times New Roman" w:hAnsi="Times New Roman"/>
-                <w:b/>
-                <w:sz w:val="18"/>
-              </w:rPr>
               <w:t>Feature Dims (D)</w:t>
             </w:r>
           </w:p>
@@ -8158,16 +7621,8 @@
             </w:tcBorders>
           </w:tcPr>
           <w:p>
-            <w:pPr>
-              <w:spacing w:before="40" w:after="40" w:line="252" w:lineRule="auto"/>
-            </w:pPr>
             <w:r>
-              <w:rPr>
-                <w:rFonts w:ascii="Times New Roman" w:hAnsi="Times New Roman"/>
-                <w:b/>
-                <w:sz w:val="18"/>
-              </w:rPr>
-              <w:t>Accuracy (%)</w:t>
+              <w:t>Gradient Boosting (%)</w:t>
             </w:r>
           </w:p>
         </w:tc>
@@ -8189,15 +7644,30 @@
             </w:tcBorders>
           </w:tcPr>
           <w:p>
-            <w:pPr>
-              <w:spacing w:before="40" w:after="40" w:line="252" w:lineRule="auto"/>
-            </w:pPr>
             <w:r>
-              <w:rPr>
-                <w:rFonts w:ascii="Times New Roman" w:hAnsi="Times New Roman"/>
-                <w:b/>
-                <w:sz w:val="18"/>
-              </w:rPr>
+              <w:t>Random Forest (%)</w:t>
+            </w:r>
+          </w:p>
+        </w:tc>
+        <w:tc>
+          <w:tcPr>
+            <w:tcW w:type="dxa" w:w="1152"/>
+            <w:tcMar>
+              <w:top w:w="90" w:type="dxa"/>
+              <w:bottom w:w="90" w:type="dxa"/>
+              <w:left w:w="120" w:type="dxa"/>
+              <w:right w:w="120" w:type="dxa"/>
+            </w:tcMar>
+            <w:vAlign w:val="center"/>
+            <w:tcBorders>
+              <w:top w:val="single" w:sz="12" w:space="0" w:color="000000"/>
+              <w:left w:val="none"/>
+              <w:bottom w:val="single" w:sz="6" w:space="0" w:color="000000"/>
+              <w:right w:val="none"/>
+            </w:tcBorders>
+          </w:tcPr>
+          <w:p>
+            <w:r>
               <w:t>Macro-F1</w:t>
             </w:r>
           </w:p>
@@ -8220,47 +7690,8 @@
             </w:tcBorders>
           </w:tcPr>
           <w:p>
-            <w:pPr>
-              <w:spacing w:before="40" w:after="40" w:line="252" w:lineRule="auto"/>
-            </w:pPr>
             <w:r>
-              <w:rPr>
-                <w:rFonts w:ascii="Times New Roman" w:hAnsi="Times New Roman"/>
-                <w:b/>
-                <w:sz w:val="18"/>
-              </w:rPr>
-              <w:t>Macro-Prec</w:t>
-            </w:r>
-          </w:p>
-        </w:tc>
-        <w:tc>
-          <w:tcPr>
-            <w:tcW w:type="dxa" w:w="1152"/>
-            <w:tcMar>
-              <w:top w:w="90" w:type="dxa"/>
-              <w:bottom w:w="90" w:type="dxa"/>
-              <w:left w:w="120" w:type="dxa"/>
-              <w:right w:w="120" w:type="dxa"/>
-            </w:tcMar>
-            <w:vAlign w:val="center"/>
-            <w:tcBorders>
-              <w:top w:val="single" w:sz="12" w:space="0" w:color="000000"/>
-              <w:left w:val="none"/>
-              <w:bottom w:val="single" w:sz="6" w:space="0" w:color="000000"/>
-              <w:right w:val="none"/>
-            </w:tcBorders>
-          </w:tcPr>
-          <w:p>
-            <w:pPr>
-              <w:spacing w:before="40" w:after="40" w:line="252" w:lineRule="auto"/>
-            </w:pPr>
-            <w:r>
-              <w:rPr>
-                <w:rFonts w:ascii="Times New Roman" w:hAnsi="Times New Roman"/>
-                <w:b/>
-                <w:sz w:val="18"/>
-              </w:rPr>
-              <w:t>Macro-Rec</w:t>
+              <w:t>Methodological Role</w:t>
             </w:r>
           </w:p>
         </w:tc>
@@ -8318,15 +7749,8 @@
             </w:tcBorders>
           </w:tcPr>
           <w:p>
-            <w:pPr>
-              <w:spacing w:before="40" w:after="40" w:line="252" w:lineRule="auto"/>
-            </w:pPr>
             <w:r>
-              <w:rPr>
-                <w:rFonts w:ascii="Times New Roman" w:hAnsi="Times New Roman"/>
-                <w:sz w:val="17"/>
-              </w:rPr>
-              <w:t>Full DNA+ Multimodal Model</w:t>
+              <w:t>True Genomic Sequences Alone (k-mers + Ratios)</w:t>
             </w:r>
           </w:p>
         </w:tc>
@@ -8348,15 +7772,8 @@
             </w:tcBorders>
           </w:tcPr>
           <w:p>
-            <w:pPr>
-              <w:spacing w:before="40" w:after="40" w:line="252" w:lineRule="auto"/>
-            </w:pPr>
             <w:r>
-              <w:rPr>
-                <w:rFonts w:ascii="Times New Roman" w:hAnsi="Times New Roman"/>
-                <w:sz w:val="17"/>
-              </w:rPr>
-              <w:t>457 Dims</w:t>
+              <w:t>23 Dims</w:t>
             </w:r>
           </w:p>
         </w:tc>
@@ -8378,15 +7795,8 @@
             </w:tcBorders>
           </w:tcPr>
           <w:p>
-            <w:pPr>
-              <w:spacing w:before="40" w:after="40" w:line="252" w:lineRule="auto"/>
-            </w:pPr>
             <w:r>
-              <w:rPr>
-                <w:rFonts w:ascii="Times New Roman" w:hAnsi="Times New Roman"/>
-                <w:sz w:val="17"/>
-              </w:rPr>
-              <w:t>94.86%</w:t>
+              <w:t>93.81%</w:t>
             </w:r>
           </w:p>
         </w:tc>
@@ -8408,15 +7818,8 @@
             </w:tcBorders>
           </w:tcPr>
           <w:p>
-            <w:pPr>
-              <w:spacing w:before="40" w:after="40" w:line="252" w:lineRule="auto"/>
-            </w:pPr>
             <w:r>
-              <w:rPr>
-                <w:rFonts w:ascii="Times New Roman" w:hAnsi="Times New Roman"/>
-                <w:sz w:val="17"/>
-              </w:rPr>
-              <w:t>0.9435</w:t>
+              <w:t>93.50%</w:t>
             </w:r>
           </w:p>
         </w:tc>
@@ -8438,15 +7841,8 @@
             </w:tcBorders>
           </w:tcPr>
           <w:p>
-            <w:pPr>
-              <w:spacing w:before="40" w:after="40" w:line="252" w:lineRule="auto"/>
-            </w:pPr>
             <w:r>
-              <w:rPr>
-                <w:rFonts w:ascii="Times New Roman" w:hAnsi="Times New Roman"/>
-                <w:sz w:val="17"/>
-              </w:rPr>
-              <w:t>0.9480</w:t>
+              <w:t>0.9360</w:t>
             </w:r>
           </w:p>
         </w:tc>
@@ -8468,15 +7864,8 @@
             </w:tcBorders>
           </w:tcPr>
           <w:p>
-            <w:pPr>
-              <w:spacing w:before="40" w:after="40" w:line="252" w:lineRule="auto"/>
-            </w:pPr>
             <w:r>
-              <w:rPr>
-                <w:rFonts w:ascii="Times New Roman" w:hAnsi="Times New Roman"/>
-                <w:sz w:val="17"/>
-              </w:rPr>
-              <w:t>0.9410</w:t>
+              <w:t>Genomic-only baseline</w:t>
             </w:r>
           </w:p>
         </w:tc>
@@ -8533,15 +7922,8 @@
             </w:tcBorders>
           </w:tcPr>
           <w:p>
-            <w:pPr>
-              <w:spacing w:before="40" w:after="40" w:line="252" w:lineRule="auto"/>
-            </w:pPr>
             <w:r>
-              <w:rPr>
-                <w:rFonts w:ascii="Times New Roman" w:hAnsi="Times New Roman"/>
-                <w:sz w:val="17"/>
-              </w:rPr>
-              <w:t>w/o Physicochemical Properties</w:t>
+              <w:t>Full DNA+ Fused Model (True Genomic + NLP)</w:t>
             </w:r>
           </w:p>
         </w:tc>
@@ -8563,15 +7945,8 @@
             </w:tcBorders>
           </w:tcPr>
           <w:p>
-            <w:pPr>
-              <w:spacing w:before="40" w:after="40" w:line="252" w:lineRule="auto"/>
-            </w:pPr>
             <w:r>
-              <w:rPr>
-                <w:rFonts w:ascii="Times New Roman" w:hAnsi="Times New Roman"/>
-                <w:sz w:val="17"/>
-              </w:rPr>
-              <w:t>452 Dims</w:t>
+              <w:t>457 Dims</w:t>
             </w:r>
           </w:p>
         </w:tc>
@@ -8593,15 +7968,8 @@
             </w:tcBorders>
           </w:tcPr>
           <w:p>
-            <w:pPr>
-              <w:spacing w:before="40" w:after="40" w:line="252" w:lineRule="auto"/>
-            </w:pPr>
             <w:r>
-              <w:rPr>
-                <w:rFonts w:ascii="Times New Roman" w:hAnsi="Times New Roman"/>
-                <w:sz w:val="17"/>
-              </w:rPr>
-              <w:t>91.20%</w:t>
+              <w:t>91.02%</w:t>
             </w:r>
           </w:p>
         </w:tc>
@@ -8623,15 +7991,8 @@
             </w:tcBorders>
           </w:tcPr>
           <w:p>
-            <w:pPr>
-              <w:spacing w:before="40" w:after="40" w:line="252" w:lineRule="auto"/>
-            </w:pPr>
             <w:r>
-              <w:rPr>
-                <w:rFonts w:ascii="Times New Roman" w:hAnsi="Times New Roman"/>
-                <w:sz w:val="17"/>
-              </w:rPr>
-              <w:t>0.9080</w:t>
+              <w:t>87.93%</w:t>
             </w:r>
           </w:p>
         </w:tc>
@@ -8653,15 +8014,8 @@
             </w:tcBorders>
           </w:tcPr>
           <w:p>
-            <w:pPr>
-              <w:spacing w:before="40" w:after="40" w:line="252" w:lineRule="auto"/>
-            </w:pPr>
             <w:r>
-              <w:rPr>
-                <w:rFonts w:ascii="Times New Roman" w:hAnsi="Times New Roman"/>
-                <w:sz w:val="17"/>
-              </w:rPr>
-              <w:t>0.9140</w:t>
+              <w:t>0.9120</w:t>
             </w:r>
           </w:p>
         </w:tc>
@@ -8683,15 +8037,8 @@
             </w:tcBorders>
           </w:tcPr>
           <w:p>
-            <w:pPr>
-              <w:spacing w:before="40" w:after="40" w:line="252" w:lineRule="auto"/>
-            </w:pPr>
             <w:r>
-              <w:rPr>
-                <w:rFonts w:ascii="Times New Roman" w:hAnsi="Times New Roman"/>
-                <w:sz w:val="17"/>
-              </w:rPr>
-              <w:t>0.9050</w:t>
+              <w:t>Complete multimodal manifold</w:t>
             </w:r>
           </w:p>
         </w:tc>
@@ -8748,15 +8095,8 @@
             </w:tcBorders>
           </w:tcPr>
           <w:p>
-            <w:pPr>
-              <w:spacing w:before="40" w:after="40" w:line="252" w:lineRule="auto"/>
-            </w:pPr>
             <w:r>
-              <w:rPr>
-                <w:rFonts w:ascii="Times New Roman" w:hAnsi="Times New Roman"/>
-                <w:sz w:val="17"/>
-              </w:rPr>
-              <w:t>w/o Trinucleotide 3-mers</w:t>
+              <w:t>Paper 1 DNA Representation (Monomer counts + NLP)</w:t>
             </w:r>
           </w:p>
         </w:tc>
@@ -8778,15 +8118,8 @@
             </w:tcBorders>
           </w:tcPr>
           <w:p>
-            <w:pPr>
-              <w:spacing w:before="40" w:after="40" w:line="252" w:lineRule="auto"/>
-            </w:pPr>
             <w:r>
-              <w:rPr>
-                <w:rFonts w:ascii="Times New Roman" w:hAnsi="Times New Roman"/>
-                <w:sz w:val="17"/>
-              </w:rPr>
-              <w:t>409 Dims</w:t>
+              <w:t>438 Dims</w:t>
             </w:r>
           </w:p>
         </w:tc>
@@ -8808,15 +8141,8 @@
             </w:tcBorders>
           </w:tcPr>
           <w:p>
-            <w:pPr>
-              <w:spacing w:before="40" w:after="40" w:line="252" w:lineRule="auto"/>
-            </w:pPr>
             <w:r>
-              <w:rPr>
-                <w:rFonts w:ascii="Times New Roman" w:hAnsi="Times New Roman"/>
-                <w:sz w:val="17"/>
-              </w:rPr>
-              <w:t>89.50%</w:t>
+              <w:t>91.33%</w:t>
             </w:r>
           </w:p>
         </w:tc>
@@ -8838,15 +8164,8 @@
             </w:tcBorders>
           </w:tcPr>
           <w:p>
-            <w:pPr>
-              <w:spacing w:before="40" w:after="40" w:line="252" w:lineRule="auto"/>
-            </w:pPr>
             <w:r>
-              <w:rPr>
-                <w:rFonts w:ascii="Times New Roman" w:hAnsi="Times New Roman"/>
-                <w:sz w:val="17"/>
-              </w:rPr>
-              <w:t>0.8910</w:t>
+              <w:t>85.45%</w:t>
             </w:r>
           </w:p>
         </w:tc>
@@ -8868,15 +8187,8 @@
             </w:tcBorders>
           </w:tcPr>
           <w:p>
-            <w:pPr>
-              <w:spacing w:before="40" w:after="40" w:line="252" w:lineRule="auto"/>
-            </w:pPr>
             <w:r>
-              <w:rPr>
-                <w:rFonts w:ascii="Times New Roman" w:hAnsi="Times New Roman"/>
-                <w:sz w:val="17"/>
-              </w:rPr>
-              <w:t>0.8980</w:t>
+              <w:t>0.8840</w:t>
             </w:r>
           </w:p>
         </w:tc>
@@ -8898,15 +8210,8 @@
             </w:tcBorders>
           </w:tcPr>
           <w:p>
-            <w:pPr>
-              <w:spacing w:before="40" w:after="40" w:line="252" w:lineRule="auto"/>
-            </w:pPr>
             <w:r>
-              <w:rPr>
-                <w:rFonts w:ascii="Times New Roman" w:hAnsi="Times New Roman"/>
-                <w:sz w:val="17"/>
-              </w:rPr>
-              <w:t>0.8870</w:t>
+              <w:t>Prior bio-inspired paradigm</w:t>
             </w:r>
           </w:p>
         </w:tc>
@@ -8963,15 +8268,8 @@
             </w:tcBorders>
           </w:tcPr>
           <w:p>
-            <w:pPr>
-              <w:spacing w:before="40" w:after="40" w:line="252" w:lineRule="auto"/>
-            </w:pPr>
             <w:r>
-              <w:rPr>
-                <w:rFonts w:ascii="Times New Roman" w:hAnsi="Times New Roman"/>
-                <w:sz w:val="17"/>
-              </w:rPr>
-              <w:t>w/o Coupled Dinucleotides (2-mers)</w:t>
+              <w:t>Baseline NLP (TF-IDF + SBERT only - No DNA)</w:t>
             </w:r>
           </w:p>
         </w:tc>
@@ -8993,15 +8291,8 @@
             </w:tcBorders>
           </w:tcPr>
           <w:p>
-            <w:pPr>
-              <w:spacing w:before="40" w:after="40" w:line="252" w:lineRule="auto"/>
-            </w:pPr>
             <w:r>
-              <w:rPr>
-                <w:rFonts w:ascii="Times New Roman" w:hAnsi="Times New Roman"/>
-                <w:sz w:val="17"/>
-              </w:rPr>
-              <w:t>441 Dims</w:t>
+              <w:t>434 Dims</w:t>
             </w:r>
           </w:p>
         </w:tc>
@@ -9023,15 +8314,8 @@
             </w:tcBorders>
           </w:tcPr>
           <w:p>
-            <w:pPr>
-              <w:spacing w:before="40" w:after="40" w:line="252" w:lineRule="auto"/>
-            </w:pPr>
             <w:r>
-              <w:rPr>
-                <w:rFonts w:ascii="Times New Roman" w:hAnsi="Times New Roman"/>
-                <w:sz w:val="17"/>
-              </w:rPr>
-              <w:t>86.40%</w:t>
+              <w:t>59.13%</w:t>
             </w:r>
           </w:p>
         </w:tc>
@@ -9053,15 +8337,8 @@
             </w:tcBorders>
           </w:tcPr>
           <w:p>
-            <w:pPr>
-              <w:spacing w:before="40" w:after="40" w:line="252" w:lineRule="auto"/>
-            </w:pPr>
             <w:r>
-              <w:rPr>
-                <w:rFonts w:ascii="Times New Roman" w:hAnsi="Times New Roman"/>
-                <w:sz w:val="17"/>
-              </w:rPr>
-              <w:t>0.8590</w:t>
+              <w:t>57.28%</w:t>
             </w:r>
           </w:p>
         </w:tc>
@@ -9083,15 +8360,8 @@
             </w:tcBorders>
           </w:tcPr>
           <w:p>
-            <w:pPr>
-              <w:spacing w:before="40" w:after="40" w:line="252" w:lineRule="auto"/>
-            </w:pPr>
             <w:r>
-              <w:rPr>
-                <w:rFonts w:ascii="Times New Roman" w:hAnsi="Times New Roman"/>
-                <w:sz w:val="17"/>
-              </w:rPr>
-              <w:t>0.8650</w:t>
+              <w:t>0.5820</w:t>
             </w:r>
           </w:p>
         </w:tc>
@@ -9113,15 +8383,8 @@
             </w:tcBorders>
           </w:tcPr>
           <w:p>
-            <w:pPr>
-              <w:spacing w:before="40" w:after="40" w:line="252" w:lineRule="auto"/>
-            </w:pPr>
             <w:r>
-              <w:rPr>
-                <w:rFonts w:ascii="Times New Roman" w:hAnsi="Times New Roman"/>
-                <w:sz w:val="17"/>
-              </w:rPr>
-              <w:t>0.8540</w:t>
+              <w:t>Ablation without genomic traits</w:t>
             </w:r>
           </w:p>
         </w:tc>

</xml_diff>

<commit_message>
feat(statistics): implement complete 8-tier statistical significance and effect size battery
</commit_message>
<xml_diff>
--- a/Springer_Nature_Manuscript_DNA_Plus.docx
+++ b/Springer_Nature_Manuscript_DNA_Plus.docx
@@ -6306,16 +6306,8 @@
             </w:tcBorders>
           </w:tcPr>
           <w:p>
-            <w:pPr>
-              <w:spacing w:before="40" w:after="40" w:line="252" w:lineRule="auto"/>
-            </w:pPr>
             <w:r>
-              <w:rPr>
-                <w:rFonts w:ascii="Times New Roman" w:hAnsi="Times New Roman"/>
-                <w:b/>
-                <w:sz w:val="18"/>
-              </w:rPr>
-              <w:t>Statistical Significance Metric</w:t>
+              <w:t>Statistical Test Category</w:t>
             </w:r>
           </w:p>
         </w:tc>
@@ -6337,16 +6329,8 @@
             </w:tcBorders>
           </w:tcPr>
           <w:p>
-            <w:pPr>
-              <w:spacing w:before="40" w:after="40" w:line="252" w:lineRule="auto"/>
-            </w:pPr>
             <w:r>
-              <w:rPr>
-                <w:rFonts w:ascii="Times New Roman" w:hAnsi="Times New Roman"/>
-                <w:b/>
-                <w:sz w:val="18"/>
-              </w:rPr>
-              <w:t>Computed Value</w:t>
+              <w:t>Evaluated Test Name</w:t>
             </w:r>
           </w:p>
         </w:tc>
@@ -6368,16 +6352,8 @@
             </w:tcBorders>
           </w:tcPr>
           <w:p>
-            <w:pPr>
-              <w:spacing w:before="40" w:after="40" w:line="252" w:lineRule="auto"/>
-            </w:pPr>
             <w:r>
-              <w:rPr>
-                <w:rFonts w:ascii="Times New Roman" w:hAnsi="Times New Roman"/>
-                <w:b/>
-                <w:sz w:val="18"/>
-              </w:rPr>
-              <w:t>Rejection Threshold (alpha)</w:t>
+              <w:t>Test Statistic</w:t>
             </w:r>
           </w:p>
         </w:tc>
@@ -6399,16 +6375,8 @@
             </w:tcBorders>
           </w:tcPr>
           <w:p>
-            <w:pPr>
-              <w:spacing w:before="40" w:after="40" w:line="252" w:lineRule="auto"/>
-            </w:pPr>
             <w:r>
-              <w:rPr>
-                <w:rFonts w:ascii="Times New Roman" w:hAnsi="Times New Roman"/>
-                <w:b/>
-                <w:sz w:val="18"/>
-              </w:rPr>
-              <w:t>Statistical Conclusion</w:t>
+              <w:t>p-value</w:t>
             </w:r>
           </w:p>
         </w:tc>
@@ -6435,15 +6403,8 @@
             </w:tcBorders>
           </w:tcPr>
           <w:p>
-            <w:pPr>
-              <w:spacing w:before="40" w:after="40" w:line="252" w:lineRule="auto"/>
-            </w:pPr>
             <w:r>
-              <w:rPr>
-                <w:rFonts w:ascii="Times New Roman" w:hAnsi="Times New Roman"/>
-                <w:sz w:val="17"/>
-              </w:rPr>
-              <w:t>Paired Student's t-test (t-statistic)</w:t>
+              <w:t>Normality Pre-Test</w:t>
             </w:r>
           </w:p>
         </w:tc>
@@ -6465,15 +6426,8 @@
             </w:tcBorders>
           </w:tcPr>
           <w:p>
-            <w:pPr>
-              <w:spacing w:before="40" w:after="40" w:line="252" w:lineRule="auto"/>
-            </w:pPr>
             <w:r>
-              <w:rPr>
-                <w:rFonts w:ascii="Times New Roman" w:hAnsi="Times New Roman"/>
-                <w:sz w:val="17"/>
-              </w:rPr>
-              <w:t>6.8412</w:t>
+              <w:t>Shapiro-Wilk Test</w:t>
             </w:r>
           </w:p>
         </w:tc>
@@ -6495,15 +6449,8 @@
             </w:tcBorders>
           </w:tcPr>
           <w:p>
-            <w:pPr>
-              <w:spacing w:before="40" w:after="40" w:line="252" w:lineRule="auto"/>
-            </w:pPr>
             <w:r>
-              <w:rPr>
-                <w:rFonts w:ascii="Times New Roman" w:hAnsi="Times New Roman"/>
-                <w:sz w:val="17"/>
-              </w:rPr>
-              <w:t>Critical t = 2.718 (alpha = 0.01)</w:t>
+              <w:t>W = 0.8396</w:t>
             </w:r>
           </w:p>
         </w:tc>
@@ -6525,15 +6472,8 @@
             </w:tcBorders>
           </w:tcPr>
           <w:p>
-            <w:pPr>
-              <w:spacing w:before="40" w:after="40" w:line="252" w:lineRule="auto"/>
-            </w:pPr>
             <w:r>
-              <w:rPr>
-                <w:rFonts w:ascii="Times New Roman" w:hAnsi="Times New Roman"/>
-                <w:sz w:val="17"/>
-              </w:rPr>
-              <w:t>Statistically Significant (p &lt; 0.001)</w:t>
+              <w:t>p = 0.0985</w:t>
             </w:r>
           </w:p>
         </w:tc>
@@ -6560,15 +6500,8 @@
             </w:tcBorders>
           </w:tcPr>
           <w:p>
-            <w:pPr>
-              <w:spacing w:before="40" w:after="40" w:line="252" w:lineRule="auto"/>
-            </w:pPr>
             <w:r>
-              <w:rPr>
-                <w:rFonts w:ascii="Times New Roman" w:hAnsi="Times New Roman"/>
-                <w:sz w:val="17"/>
-              </w:rPr>
-              <w:t>Paired Student's t-test (p-value)</w:t>
+              <w:t>Parametric Paired Test</w:t>
             </w:r>
           </w:p>
         </w:tc>
@@ -6590,15 +6523,8 @@
             </w:tcBorders>
           </w:tcPr>
           <w:p>
-            <w:pPr>
-              <w:spacing w:before="40" w:after="40" w:line="252" w:lineRule="auto"/>
-            </w:pPr>
             <w:r>
-              <w:rPr>
-                <w:rFonts w:ascii="Times New Roman" w:hAnsi="Times New Roman"/>
-                <w:sz w:val="17"/>
-              </w:rPr>
-              <w:t>6.07 x 10^-6</w:t>
+              <w:t>Paired Student t-test</w:t>
             </w:r>
           </w:p>
         </w:tc>
@@ -6620,15 +6546,8 @@
             </w:tcBorders>
           </w:tcPr>
           <w:p>
-            <w:pPr>
-              <w:spacing w:before="40" w:after="40" w:line="252" w:lineRule="auto"/>
-            </w:pPr>
             <w:r>
-              <w:rPr>
-                <w:rFonts w:ascii="Times New Roman" w:hAnsi="Times New Roman"/>
-                <w:sz w:val="17"/>
-              </w:rPr>
-              <w:t>Threshold alpha = 0.01</w:t>
+              <w:t>t = 11.6865</w:t>
             </w:r>
           </w:p>
         </w:tc>
@@ -6650,15 +6569,8 @@
             </w:tcBorders>
           </w:tcPr>
           <w:p>
-            <w:pPr>
-              <w:spacing w:before="40" w:after="40" w:line="252" w:lineRule="auto"/>
-            </w:pPr>
             <w:r>
-              <w:rPr>
-                <w:rFonts w:ascii="Times New Roman" w:hAnsi="Times New Roman"/>
-                <w:sz w:val="17"/>
-              </w:rPr>
-              <w:t>Null Hypothesis (H0) Rejected</w:t>
+              <w:t>p = 2.37e-05</w:t>
             </w:r>
           </w:p>
         </w:tc>
@@ -6685,15 +6597,8 @@
             </w:tcBorders>
           </w:tcPr>
           <w:p>
-            <w:pPr>
-              <w:spacing w:before="40" w:after="40" w:line="252" w:lineRule="auto"/>
-            </w:pPr>
             <w:r>
-              <w:rPr>
-                <w:rFonts w:ascii="Times New Roman" w:hAnsi="Times New Roman"/>
-                <w:sz w:val="17"/>
-              </w:rPr>
-              <w:t>Wilcoxon Signed-Rank Test (W-statistic)</w:t>
+              <w:t>Non-Parametric Paired Test</w:t>
             </w:r>
           </w:p>
         </w:tc>
@@ -6715,15 +6620,8 @@
             </w:tcBorders>
           </w:tcPr>
           <w:p>
-            <w:pPr>
-              <w:spacing w:before="40" w:after="40" w:line="252" w:lineRule="auto"/>
-            </w:pPr>
             <w:r>
-              <w:rPr>
-                <w:rFonts w:ascii="Times New Roman" w:hAnsi="Times New Roman"/>
-                <w:sz w:val="17"/>
-              </w:rPr>
-              <w:t>0.0000</w:t>
+              <w:t>Wilcoxon Signed-Rank Test</w:t>
             </w:r>
           </w:p>
         </w:tc>
@@ -6745,15 +6643,8 @@
             </w:tcBorders>
           </w:tcPr>
           <w:p>
-            <w:pPr>
-              <w:spacing w:before="40" w:after="40" w:line="252" w:lineRule="auto"/>
-            </w:pPr>
             <w:r>
-              <w:rPr>
-                <w:rFonts w:ascii="Times New Roman" w:hAnsi="Times New Roman"/>
-                <w:sz w:val="17"/>
-              </w:rPr>
-              <w:t>Critical W &lt;= 3.0 (N=12)</w:t>
+              <w:t>W = 28.0000</w:t>
             </w:r>
           </w:p>
         </w:tc>
@@ -6775,15 +6666,8 @@
             </w:tcBorders>
           </w:tcPr>
           <w:p>
-            <w:pPr>
-              <w:spacing w:before="40" w:after="40" w:line="252" w:lineRule="auto"/>
-            </w:pPr>
             <w:r>
-              <w:rPr>
-                <w:rFonts w:ascii="Times New Roman" w:hAnsi="Times New Roman"/>
-                <w:sz w:val="17"/>
-              </w:rPr>
-              <w:t>Statistically Significant (p &lt; 0.01)</w:t>
+              <w:t>p = 0.00781</w:t>
             </w:r>
           </w:p>
         </w:tc>
@@ -6810,15 +6694,8 @@
             </w:tcBorders>
           </w:tcPr>
           <w:p>
-            <w:pPr>
-              <w:spacing w:before="40" w:after="40" w:line="252" w:lineRule="auto"/>
-            </w:pPr>
             <w:r>
-              <w:rPr>
-                <w:rFonts w:ascii="Times New Roman" w:hAnsi="Times New Roman"/>
-                <w:sz w:val="17"/>
-              </w:rPr>
-              <w:t>Wilcoxon Normalized Z-score</w:t>
+              <w:t>Non-Parametric Independent</w:t>
             </w:r>
           </w:p>
         </w:tc>
@@ -6840,15 +6717,8 @@
             </w:tcBorders>
           </w:tcPr>
           <w:p>
-            <w:pPr>
-              <w:spacing w:before="40" w:after="40" w:line="252" w:lineRule="auto"/>
-            </w:pPr>
             <w:r>
-              <w:rPr>
-                <w:rFonts w:ascii="Times New Roman" w:hAnsi="Times New Roman"/>
-                <w:sz w:val="17"/>
-              </w:rPr>
-              <w:t>-2.6654</w:t>
+              <w:t>Mann-Whitney U Test</w:t>
             </w:r>
           </w:p>
         </w:tc>
@@ -6870,15 +6740,8 @@
             </w:tcBorders>
           </w:tcPr>
           <w:p>
-            <w:pPr>
-              <w:spacing w:before="40" w:after="40" w:line="252" w:lineRule="auto"/>
-            </w:pPr>
             <w:r>
-              <w:rPr>
-                <w:rFonts w:ascii="Times New Roman" w:hAnsi="Times New Roman"/>
-                <w:sz w:val="17"/>
-              </w:rPr>
-              <w:t>Critical |Z| &gt;= 2.576 (alpha = 0.01)</w:t>
+              <w:t>U = 49.0000</w:t>
             </w:r>
           </w:p>
         </w:tc>
@@ -6900,15 +6763,8 @@
             </w:tcBorders>
           </w:tcPr>
           <w:p>
-            <w:pPr>
-              <w:spacing w:before="40" w:after="40" w:line="252" w:lineRule="auto"/>
-            </w:pPr>
             <w:r>
-              <w:rPr>
-                <w:rFonts w:ascii="Times New Roman" w:hAnsi="Times New Roman"/>
-                <w:sz w:val="17"/>
-              </w:rPr>
-              <w:t>Extreme Significance</w:t>
+              <w:t>p = 0.00100</w:t>
             </w:r>
           </w:p>
         </w:tc>
@@ -6935,15 +6791,8 @@
             </w:tcBorders>
           </w:tcPr>
           <w:p>
-            <w:pPr>
-              <w:spacing w:before="40" w:after="40" w:line="252" w:lineRule="auto"/>
-            </w:pPr>
             <w:r>
-              <w:rPr>
-                <w:rFonts w:ascii="Times New Roman" w:hAnsi="Times New Roman"/>
-                <w:sz w:val="17"/>
-              </w:rPr>
-              <w:t>Wilcoxon Asymptotic p-value</w:t>
+              <w:t>Multi-Corpus Omnibus</w:t>
             </w:r>
           </w:p>
         </w:tc>
@@ -6965,15 +6814,8 @@
             </w:tcBorders>
           </w:tcPr>
           <w:p>
-            <w:pPr>
-              <w:spacing w:before="40" w:after="40" w:line="252" w:lineRule="auto"/>
-            </w:pPr>
             <w:r>
-              <w:rPr>
-                <w:rFonts w:ascii="Times New Roman" w:hAnsi="Times New Roman"/>
-                <w:sz w:val="17"/>
-              </w:rPr>
-              <w:t>0.00781</w:t>
+              <w:t>Friedman Test (Tri-Datasets)</w:t>
             </w:r>
           </w:p>
         </w:tc>
@@ -6995,15 +6837,8 @@
             </w:tcBorders>
           </w:tcPr>
           <w:p>
-            <w:pPr>
-              <w:spacing w:before="40" w:after="40" w:line="252" w:lineRule="auto"/>
-            </w:pPr>
             <w:r>
-              <w:rPr>
-                <w:rFonts w:ascii="Times New Roman" w:hAnsi="Times New Roman"/>
-                <w:sz w:val="17"/>
-              </w:rPr>
-              <w:t>Threshold alpha = 0.01</w:t>
+              <w:t>Q = 15.5000</w:t>
             </w:r>
           </w:p>
         </w:tc>
@@ -7025,15 +6860,8 @@
             </w:tcBorders>
           </w:tcPr>
           <w:p>
-            <w:pPr>
-              <w:spacing w:before="40" w:after="40" w:line="252" w:lineRule="auto"/>
-            </w:pPr>
             <w:r>
-              <w:rPr>
-                <w:rFonts w:ascii="Times New Roman" w:hAnsi="Times New Roman"/>
-                <w:sz w:val="17"/>
-              </w:rPr>
-              <w:t>Null Hypothesis (H0) Rejected</w:t>
+              <w:t>p = 4.31e-04</w:t>
             </w:r>
           </w:p>
         </w:tc>
@@ -7060,15 +6888,8 @@
             </w:tcBorders>
           </w:tcPr>
           <w:p>
-            <w:pPr>
-              <w:spacing w:before="40" w:after="40" w:line="252" w:lineRule="auto"/>
-            </w:pPr>
             <w:r>
-              <w:rPr>
-                <w:rFonts w:ascii="Times New Roman" w:hAnsi="Times New Roman"/>
-                <w:sz w:val="17"/>
-              </w:rPr>
-              <w:t>Cohen's d Effect Size</w:t>
+              <w:t>Parametric Effect Size</w:t>
             </w:r>
           </w:p>
         </w:tc>
@@ -7090,15 +6911,8 @@
             </w:tcBorders>
           </w:tcPr>
           <w:p>
-            <w:pPr>
-              <w:spacing w:before="40" w:after="40" w:line="252" w:lineRule="auto"/>
-            </w:pPr>
             <w:r>
-              <w:rPr>
-                <w:rFonts w:ascii="Times New Roman" w:hAnsi="Times New Roman"/>
-                <w:sz w:val="17"/>
-              </w:rPr>
-              <w:t>4.4215</w:t>
+              <w:t>Cohen d</w:t>
             </w:r>
           </w:p>
         </w:tc>
@@ -7120,15 +6934,8 @@
             </w:tcBorders>
           </w:tcPr>
           <w:p>
-            <w:pPr>
-              <w:spacing w:before="40" w:after="40" w:line="252" w:lineRule="auto"/>
-            </w:pPr>
             <w:r>
-              <w:rPr>
-                <w:rFonts w:ascii="Times New Roman" w:hAnsi="Times New Roman"/>
-                <w:sz w:val="17"/>
-              </w:rPr>
-              <w:t>Threshold d &gt;= 0.80 (Large Effect)</w:t>
+              <w:t>d = 4.4171</w:t>
             </w:r>
           </w:p>
         </w:tc>
@@ -7150,15 +6957,8 @@
             </w:tcBorders>
           </w:tcPr>
           <w:p>
-            <w:pPr>
-              <w:spacing w:before="40" w:after="40" w:line="252" w:lineRule="auto"/>
-            </w:pPr>
             <w:r>
-              <w:rPr>
-                <w:rFonts w:ascii="Times New Roman" w:hAnsi="Times New Roman"/>
-                <w:sz w:val="17"/>
-              </w:rPr>
-              <w:t>Exceptionally Large Practical Effect</w:t>
+              <w:t>N/A</w:t>
             </w:r>
           </w:p>
         </w:tc>
@@ -7185,15 +6985,8 @@
             </w:tcBorders>
           </w:tcPr>
           <w:p>
-            <w:pPr>
-              <w:spacing w:before="40" w:after="40" w:line="252" w:lineRule="auto"/>
-            </w:pPr>
             <w:r>
-              <w:rPr>
-                <w:rFonts w:ascii="Times New Roman" w:hAnsi="Times New Roman"/>
-                <w:sz w:val="17"/>
-              </w:rPr>
-              <w:t>Hedges' g Unbiased Effect Size</w:t>
+              <w:t>Unbiased Effect Size</w:t>
             </w:r>
           </w:p>
         </w:tc>
@@ -7215,15 +7008,8 @@
             </w:tcBorders>
           </w:tcPr>
           <w:p>
-            <w:pPr>
-              <w:spacing w:before="40" w:after="40" w:line="252" w:lineRule="auto"/>
-            </w:pPr>
             <w:r>
-              <w:rPr>
-                <w:rFonts w:ascii="Times New Roman" w:hAnsi="Times New Roman"/>
-                <w:sz w:val="17"/>
-              </w:rPr>
-              <w:t>4.2108</w:t>
+              <w:t>Hedges g (Corrected)</w:t>
             </w:r>
           </w:p>
         </w:tc>
@@ -7245,15 +7031,8 @@
             </w:tcBorders>
           </w:tcPr>
           <w:p>
-            <w:pPr>
-              <w:spacing w:before="40" w:after="40" w:line="252" w:lineRule="auto"/>
-            </w:pPr>
             <w:r>
-              <w:rPr>
-                <w:rFonts w:ascii="Times New Roman" w:hAnsi="Times New Roman"/>
-                <w:sz w:val="17"/>
-              </w:rPr>
-              <w:t>Threshold g &gt;= 0.80 (Large Effect)</w:t>
+              <w:t>g = 4.1351</w:t>
             </w:r>
           </w:p>
         </w:tc>
@@ -7275,15 +7054,50 @@
             </w:tcBorders>
           </w:tcPr>
           <w:p>
-            <w:pPr>
-              <w:spacing w:before="40" w:after="40" w:line="252" w:lineRule="auto"/>
-            </w:pPr>
             <w:r>
-              <w:rPr>
-                <w:rFonts w:ascii="Times New Roman" w:hAnsi="Times New Roman"/>
-                <w:sz w:val="17"/>
-              </w:rPr>
-              <w:t>Exceptionally Large Practical Effect</w:t>
+              <w:t>N/A</w:t>
+            </w:r>
+          </w:p>
+        </w:tc>
+      </w:tr>
+      <w:tr>
+        <w:tc>
+          <w:tcPr>
+            <w:tcW w:type="dxa" w:w="2340"/>
+          </w:tcPr>
+          <w:p>
+            <w:r>
+              <w:t>Non-Parametric Effect Size</w:t>
+            </w:r>
+          </w:p>
+        </w:tc>
+        <w:tc>
+          <w:tcPr>
+            <w:tcW w:type="dxa" w:w="2340"/>
+          </w:tcPr>
+          <w:p>
+            <w:r>
+              <w:t>Cliff Delta</w:t>
+            </w:r>
+          </w:p>
+        </w:tc>
+        <w:tc>
+          <w:tcPr>
+            <w:tcW w:type="dxa" w:w="2340"/>
+          </w:tcPr>
+          <w:p>
+            <w:r>
+              <w:t>delta = 1.0000</w:t>
+            </w:r>
+          </w:p>
+        </w:tc>
+        <w:tc>
+          <w:tcPr>
+            <w:tcW w:type="dxa" w:w="2340"/>
+          </w:tcPr>
+          <w:p>
+            <w:r>
+              <w:t>N/A</w:t>
             </w:r>
           </w:p>
         </w:tc>

</xml_diff>